<commit_message>
BH time complexity descriptiono finished
</commit_message>
<xml_diff>
--- a/pseudocode/pairwise.docx
+++ b/pseudocode/pairwise.docx
@@ -29,14 +29,7 @@
           <w:b/>
           <w:bCs/>
         </w:rPr>
-        <w:t>FOR i = 1 to N</w:t>
-      </w:r>
-      <w:r>
-        <w:rPr>
-          <w:b/>
-          <w:bCs/>
-        </w:rPr>
-        <w:t>:</w:t>
+        <w:t>FOR i = 1 to N:</w:t>
       </w:r>
     </w:p>
     <w:p>
@@ -52,14 +45,7 @@
           <w:bCs/>
         </w:rPr>
         <w:tab/>
-        <w:t xml:space="preserve">SET </w:t>
-      </w:r>
-      <w:r>
-        <w:rPr>
-          <w:b/>
-          <w:bCs/>
-        </w:rPr>
-        <w:t xml:space="preserve"> </w:t>
+        <w:t xml:space="preserve">SET  </w:t>
       </w:r>
       <m:oMath>
         <m:acc>
@@ -132,27 +118,7 @@
           <w:bCs/>
         </w:rPr>
         <w:tab/>
-      </w:r>
-      <w:r>
-        <w:rPr>
-          <w:b/>
-          <w:bCs/>
-        </w:rPr>
-        <w:t xml:space="preserve">FOR </w:t>
-      </w:r>
-      <w:r>
-        <w:rPr>
-          <w:b/>
-          <w:bCs/>
-        </w:rPr>
-        <w:t>j</w:t>
-      </w:r>
-      <w:r>
-        <w:rPr>
-          <w:b/>
-          <w:bCs/>
-        </w:rPr>
-        <w:t xml:space="preserve"> = 1 to N:</w:t>
+        <w:t>FOR j = 1 to N:</w:t>
       </w:r>
     </w:p>
     <w:p>
@@ -463,6 +429,14 @@
         </w:rPr>
         <w:t>END</w:t>
       </w:r>
+    </w:p>
+    <w:p>
+      <w:pPr>
+        <w:rPr>
+          <w:b/>
+          <w:bCs/>
+        </w:rPr>
+      </w:pPr>
     </w:p>
     <w:sectPr>
       <w:pgSz w:w="11906" w:h="16838"/>

</xml_diff>